<commit_message>
docs: sharpen engineering resumes and refresh downloads
</commit_message>
<xml_diff>
--- a/public/documents/conold-chisinahama-resume-concise.docx
+++ b/public/documents/conold-chisinahama-resume-concise.docx
@@ -18,7 +18,7 @@
         <w:rPr>
           <w:rFonts w:ascii="Arial" w:hAnsi="Arial"/>
           <w:b/>
-          <w:color w:val="1D6665"/>
+          <w:color w:val="000000"/>
           <w:sz w:val="22"/>
         </w:rPr>
         <w:t>Full-Stack Software Developer | Customer Success Lead</w:t>
@@ -29,8 +29,34 @@
         <w:pStyle w:val="ResumeMeta"/>
       </w:pPr>
       <w:r>
-        <w:t>Johannesburg, South Africa | +27 82 886 8556 | cthandoc@gmail.com | linkedin.com/in/conold | github.com/thvndx</w:t>
+        <w:t>Johannesburg, South Africa | +27 82 886 8556 | cthandoc@gmail.com</w:t>
       </w:r>
+    </w:p>
+    <w:p>
+      <w:pPr>
+        <w:pStyle w:val="ResumeMeta"/>
+      </w:pPr>
+      <w:hyperlink r:id="rId9">
+        <w:r>
+          <w:t>conold-portfolio.vercel.app</w:t>
+        </w:r>
+      </w:hyperlink>
+      <w:r>
+        <w:t xml:space="preserve"> | </w:t>
+      </w:r>
+      <w:hyperlink r:id="rId10">
+        <w:r>
+          <w:t>linkedin.com/in/conold</w:t>
+        </w:r>
+      </w:hyperlink>
+      <w:r>
+        <w:t xml:space="preserve"> | </w:t>
+      </w:r>
+      <w:hyperlink r:id="rId11">
+        <w:r>
+          <w:t>github.com/thvndx</w:t>
+        </w:r>
+      </w:hyperlink>
     </w:p>
     <w:p>
       <w:pPr>
@@ -47,10 +73,10 @@
       <w:r>
         <w:rPr>
           <w:rFonts w:ascii="Arial" w:hAnsi="Arial"/>
-          <w:color w:val="17201D"/>
-          <w:sz w:val="18"/>
+          <w:color w:val="000000"/>
+          <w:sz w:val="20"/>
         </w:rPr>
-        <w:t>Full-stack software developer with a customer-success foundation, building secure operational products from problem definition through deployment. Leads a four-person support operation, with two direct reports, while delivering internal AI, analytics and workflow tools adopted across the team and adjacent departments.</w:t>
+        <w:t>Full-stack software developer building TypeScript applications, API integrations and analytics tools used by a four-person support operation and adjacent departments. Owns product definition, implementation, testing and deployment, drawing on customer-success leadership to solve operational problems.</w:t>
       </w:r>
     </w:p>
     <w:p>
@@ -69,19 +95,19 @@
         <w:rPr>
           <w:rFonts w:ascii="Arial" w:hAnsi="Arial"/>
           <w:b/>
-          <w:color w:val="17201D"/>
-          <w:sz w:val="18"/>
+          <w:color w:val="000000"/>
+          <w:sz w:val="20"/>
         </w:rPr>
-        <w:t xml:space="preserve">Engineering: </w:t>
+        <w:t xml:space="preserve">Development: </w:t>
       </w:r>
       <w:r>
         <w:rPr>
           <w:rFonts w:ascii="Arial" w:hAnsi="Arial"/>
           <w:b w:val="0"/>
-          <w:color w:val="4C5853"/>
-          <w:sz w:val="18"/>
+          <w:color w:val="2D2D2D"/>
+          <w:sz w:val="20"/>
         </w:rPr>
-        <w:t>TypeScript, React, Next.js, Node.js, Python, PostgreSQL, Supabase</w:t>
+        <w:t>TypeScript, JavaScript, React, Next.js, Node.js, Python, PostgreSQL</w:t>
       </w:r>
     </w:p>
     <w:p>
@@ -92,8 +118,8 @@
         <w:rPr>
           <w:rFonts w:ascii="Arial" w:hAnsi="Arial"/>
           <w:b/>
-          <w:color w:val="17201D"/>
-          <w:sz w:val="18"/>
+          <w:color w:val="000000"/>
+          <w:sz w:val="20"/>
         </w:rPr>
         <w:t xml:space="preserve">Delivery: </w:t>
       </w:r>
@@ -101,33 +127,10 @@
         <w:rPr>
           <w:rFonts w:ascii="Arial" w:hAnsi="Arial"/>
           <w:b w:val="0"/>
-          <w:color w:val="4C5853"/>
-          <w:sz w:val="18"/>
+          <w:color w:val="2D2D2D"/>
+          <w:sz w:val="20"/>
         </w:rPr>
-        <w:t>API integrations, data modeling, automation, testing, GitHub Actions, Railway, Vercel</w:t>
-      </w:r>
-    </w:p>
-    <w:p>
-      <w:pPr>
-        <w:spacing w:after="20"/>
-      </w:pPr>
-      <w:r>
-        <w:rPr>
-          <w:rFonts w:ascii="Arial" w:hAnsi="Arial"/>
-          <w:b/>
-          <w:color w:val="17201D"/>
-          <w:sz w:val="18"/>
-        </w:rPr>
-        <w:t xml:space="preserve">Product: </w:t>
-      </w:r>
-      <w:r>
-        <w:rPr>
-          <w:rFonts w:ascii="Arial" w:hAnsi="Arial"/>
-          <w:b w:val="0"/>
-          <w:color w:val="4C5853"/>
-          <w:sz w:val="18"/>
-        </w:rPr>
-        <w:t>Product discovery, operational analytics, customer-success systems, AI-assisted development</w:t>
+        <w:t>REST APIs, Supabase, Vitest, Playwright, GitHub Actions, Railway, Vercel</w:t>
       </w:r>
     </w:p>
     <w:p>
@@ -147,7 +150,7 @@
         <w:rPr>
           <w:rFonts w:ascii="Arial" w:hAnsi="Arial"/>
           <w:b/>
-          <w:color w:val="17201D"/>
+          <w:color w:val="000000"/>
           <w:sz w:val="21"/>
         </w:rPr>
         <w:t>Customer Success Lead</w:t>
@@ -156,7 +159,7 @@
         <w:rPr>
           <w:rFonts w:ascii="Arial" w:hAnsi="Arial"/>
           <w:b/>
-          <w:color w:val="4C5853"/>
+          <w:color w:val="2D2D2D"/>
           <w:sz w:val="21"/>
         </w:rPr>
         <w:t xml:space="preserve"> | Connectivity and e-commerce business</w:t>
@@ -179,10 +182,10 @@
       <w:r>
         <w:rPr>
           <w:rFonts w:ascii="Arial" w:hAnsi="Arial"/>
-          <w:color w:val="17201D"/>
-          <w:sz w:val="18"/>
+          <w:color w:val="000000"/>
+          <w:sz w:val="20"/>
         </w:rPr>
-        <w:t>Lead two direct reports within a four-person support operation spanning customer communication, technical escalation, call queues and shared inboxes.</w:t>
+        <w:t>Built and deployed full-stack tools for customer context, quality review and performance reporting, adopted across the full support team and adjacent departments.</w:t>
       </w:r>
     </w:p>
     <w:p>
@@ -194,10 +197,10 @@
       <w:r>
         <w:rPr>
           <w:rFonts w:ascii="Arial" w:hAnsi="Arial"/>
-          <w:color w:val="17201D"/>
-          <w:sz w:val="18"/>
+          <w:color w:val="000000"/>
+          <w:sz w:val="20"/>
         </w:rPr>
-        <w:t>Maintain measured email response and callback times below two hours, with CSAT above 80%.</w:t>
+        <w:t>Integrated support, call and commerce data into a customer workspace, reducing context gathering from approximately 20 minutes to 30 seconds per interaction.</w:t>
       </w:r>
     </w:p>
     <w:p>
@@ -209,10 +212,10 @@
       <w:r>
         <w:rPr>
           <w:rFonts w:ascii="Arial" w:hAnsi="Arial"/>
-          <w:color w:val="17201D"/>
-          <w:sz w:val="18"/>
+          <w:color w:val="000000"/>
+          <w:sz w:val="20"/>
         </w:rPr>
-        <w:t>Define, build, test and deploy internal full-stack products for customer context, quality assurance, experience analysis and performance reporting.</w:t>
+        <w:t>Automated KPI report generation and QA selection/compilation, reducing each workflow from approximately two hours to about one minute while retaining human review.</w:t>
       </w:r>
     </w:p>
     <w:p>
@@ -224,10 +227,10 @@
       <w:r>
         <w:rPr>
           <w:rFonts w:ascii="Arial" w:hAnsi="Arial"/>
-          <w:color w:val="17201D"/>
-          <w:sz w:val="18"/>
+          <w:color w:val="000000"/>
+          <w:sz w:val="20"/>
         </w:rPr>
-        <w:t>Reduced customer-context gathering from approximately 20 minutes to 30 seconds per interaction by consolidating fragmented provider data.</w:t>
+        <w:t>Implemented explicit identity review, independent access controls and data-freshness states to prevent ambiguous or incomplete data from driving unsafe decisions.</w:t>
       </w:r>
     </w:p>
     <w:p>
@@ -239,25 +242,10 @@
       <w:r>
         <w:rPr>
           <w:rFonts w:ascii="Arial" w:hAnsi="Arial"/>
-          <w:color w:val="17201D"/>
-          <w:sz w:val="18"/>
+          <w:color w:val="000000"/>
+          <w:sz w:val="20"/>
         </w:rPr>
-        <w:t>Reduced KPI report generation and QA selection/compilation from approximately two hours to about one minute while retaining human review.</w:t>
-      </w:r>
-    </w:p>
-    <w:p>
-      <w:pPr>
-        <w:pStyle w:val="ListBullet"/>
-        <w:spacing w:after="28" w:line="240" w:lineRule="auto"/>
-        <w:ind w:left="259" w:hanging="202"/>
-      </w:pPr>
-      <w:r>
-        <w:rPr>
-          <w:rFonts w:ascii="Arial" w:hAnsi="Arial"/>
-          <w:color w:val="17201D"/>
-          <w:sz w:val="18"/>
-        </w:rPr>
-        <w:t>Drove adoption across all four support agents and adjacent departments; reduced recurring software costs through vendor negotiation and provider changes.</w:t>
+        <w:t>Lead two direct reports within a four-person operation; maintain measured email response and callback times below two hours and customer satisfaction above 80%.</w:t>
       </w:r>
     </w:p>
     <w:p>
@@ -276,8 +264,8 @@
         <w:rPr>
           <w:rFonts w:ascii="Arial" w:hAnsi="Arial"/>
           <w:b/>
-          <w:color w:val="17201D"/>
-          <w:sz w:val="18"/>
+          <w:color w:val="000000"/>
+          <w:sz w:val="20"/>
         </w:rPr>
         <w:t xml:space="preserve">Support Quality Platform: </w:t>
       </w:r>
@@ -285,10 +273,10 @@
         <w:rPr>
           <w:rFonts w:ascii="Arial" w:hAnsi="Arial"/>
           <w:b w:val="0"/>
-          <w:color w:val="4C5853"/>
-          <w:sz w:val="18"/>
+          <w:color w:val="2D2D2D"/>
+          <w:sz w:val="20"/>
         </w:rPr>
-        <w:t>AI-assisted, evidence-backed conversation QA with explicit manual, automation and reporting controls.</w:t>
+        <w:t>TypeScript, React, Node.js, PostgreSQL, OpenAI. Built evidence-backed conversation scoring, sampling and manager reporting with separate manual and automated permissions.</w:t>
       </w:r>
     </w:p>
     <w:p>
@@ -299,8 +287,8 @@
         <w:rPr>
           <w:rFonts w:ascii="Arial" w:hAnsi="Arial"/>
           <w:b/>
-          <w:color w:val="17201D"/>
-          <w:sz w:val="18"/>
+          <w:color w:val="000000"/>
+          <w:sz w:val="20"/>
         </w:rPr>
         <w:t xml:space="preserve">Customer Operations Workbench: </w:t>
       </w:r>
@@ -308,10 +296,10 @@
         <w:rPr>
           <w:rFonts w:ascii="Arial" w:hAnsi="Arial"/>
           <w:b w:val="0"/>
-          <w:color w:val="4C5853"/>
-          <w:sz w:val="18"/>
+          <w:color w:val="2D2D2D"/>
+          <w:sz w:val="20"/>
         </w:rPr>
-        <w:t>Unified customer context across support, call and commerce systems with fail-closed identity review.</w:t>
+        <w:t>TypeScript, React, Node.js, PostgreSQL, Redis. Integrated Front, Shopify and Aircall with bounded caching and explicit review of conflicting customer matches.</w:t>
       </w:r>
     </w:p>
     <w:p>
@@ -322,8 +310,8 @@
         <w:rPr>
           <w:rFonts w:ascii="Arial" w:hAnsi="Arial"/>
           <w:b/>
-          <w:color w:val="17201D"/>
-          <w:sz w:val="18"/>
+          <w:color w:val="000000"/>
+          <w:sz w:val="20"/>
         </w:rPr>
         <w:t xml:space="preserve">Operations Performance Hub: </w:t>
       </w:r>
@@ -331,10 +319,10 @@
         <w:rPr>
           <w:rFonts w:ascii="Arial" w:hAnsi="Arial"/>
           <w:b w:val="0"/>
-          <w:color w:val="4C5853"/>
-          <w:sz w:val="18"/>
+          <w:color w:val="2D2D2D"/>
+          <w:sz w:val="20"/>
         </w:rPr>
-        <w:t>Provider-backed KPI reporting with explicit data freshness, eligibility and request-budget controls.</w:t>
+        <w:t>TypeScript, React, PostgreSQL. Separated raw activity from KPI eligibility and added persisted, budget-aware provider synchronization.</w:t>
       </w:r>
     </w:p>
     <w:p>
@@ -345,31 +333,8 @@
         <w:rPr>
           <w:rFonts w:ascii="Arial" w:hAnsi="Arial"/>
           <w:b/>
-          <w:color w:val="17201D"/>
-          <w:sz w:val="18"/>
-        </w:rPr>
-        <w:t xml:space="preserve">PromoStudio: </w:t>
-      </w:r>
-      <w:r>
-        <w:rPr>
-          <w:rFonts w:ascii="Arial" w:hAnsi="Arial"/>
-          <w:b w:val="0"/>
-          <w:color w:val="4C5853"/>
-          <w:sz w:val="18"/>
-        </w:rPr>
-        <w:t>Approval-first AI campaign generation, scheduling and social-provider integration.</w:t>
-      </w:r>
-    </w:p>
-    <w:p>
-      <w:pPr>
-        <w:spacing w:after="30"/>
-      </w:pPr>
-      <w:r>
-        <w:rPr>
-          <w:rFonts w:ascii="Arial" w:hAnsi="Arial"/>
-          <w:b/>
-          <w:color w:val="17201D"/>
-          <w:sz w:val="18"/>
+          <w:color w:val="000000"/>
+          <w:sz w:val="20"/>
         </w:rPr>
         <w:t xml:space="preserve">Recalibrate: </w:t>
       </w:r>
@@ -377,10 +342,10 @@
         <w:rPr>
           <w:rFonts w:ascii="Arial" w:hAnsi="Arial"/>
           <w:b w:val="0"/>
-          <w:color w:val="4C5853"/>
-          <w:sz w:val="18"/>
+          <w:color w:val="2D2D2D"/>
+          <w:sz w:val="20"/>
         </w:rPr>
-        <w:t>Local-first mobile planning built around adaptive scheduling and supervised guidance.</w:t>
+        <w:t>React Native, Expo. Built a local-first planning MVP with adaptive scheduling and supervised guidance.</w:t>
       </w:r>
     </w:p>
     <w:p>
@@ -398,8 +363,8 @@
       <w:r>
         <w:rPr>
           <w:rFonts w:ascii="Arial" w:hAnsi="Arial"/>
-          <w:color w:val="17201D"/>
-          <w:sz w:val="18"/>
+          <w:color w:val="000000"/>
+          <w:sz w:val="19"/>
         </w:rPr>
         <w:t>Technical Sales and Support, 2020-2023 | Technician, 2019 | Technical Sales Consultant, 2015-2017</w:t>
       </w:r>
@@ -412,8 +377,8 @@
         <w:rPr>
           <w:rFonts w:ascii="Arial" w:hAnsi="Arial"/>
           <w:b/>
-          <w:color w:val="17201D"/>
-          <w:sz w:val="18"/>
+          <w:color w:val="000000"/>
+          <w:sz w:val="19"/>
         </w:rPr>
         <w:t>National Diploma in Business Information Technology, University of Johannesburg, 2014-2018</w:t>
       </w:r>
@@ -422,14 +387,13 @@
       <w:r>
         <w:rPr>
           <w:rFonts w:ascii="Arial" w:hAnsi="Arial"/>
-          <w:color w:val="17201D"/>
-          <w:sz w:val="18"/>
+          <w:color w:val="000000"/>
+          <w:sz w:val="19"/>
         </w:rPr>
         <w:t>Peplink Certified Engineer, awarded November 2025, valid through November 2027</w:t>
       </w:r>
     </w:p>
     <w:sectPr>
-      <w:footerReference w:type="default" r:id="rId9"/>
       <w:pgSz w:w="12240" w:h="15840"/>
       <w:pgMar w:top="835" w:right="1037" w:bottom="835" w:left="1037" w:header="720" w:footer="720" w:gutter="0"/>
       <w:cols w:space="720"/>
@@ -437,26 +401,6 @@
     </w:sectPr>
   </w:body>
 </w:document>
-</file>
-
-<file path=word/footer1.xml><?xml version="1.0" encoding="utf-8"?>
-<w:ftr xmlns:m="http://schemas.openxmlformats.org/officeDocument/2006/math" xmlns:mc="http://schemas.openxmlformats.org/markup-compatibility/2006" xmlns:mo="http://schemas.microsoft.com/office/mac/office/2008/main" xmlns:mv="urn:schemas-microsoft-com:mac:vml" xmlns:o="urn:schemas-microsoft-com:office:office" xmlns:r="http://schemas.openxmlformats.org/officeDocument/2006/relationships" xmlns:v="urn:schemas-microsoft-com:vml" xmlns:w10="urn:schemas-microsoft-com:office:word" xmlns:w14="http://schemas.microsoft.com/office/word/2010/wordml" xmlns:w="http://schemas.openxmlformats.org/wordprocessingml/2006/main" xmlns:wne="http://schemas.microsoft.com/office/word/2006/wordml" xmlns:wp14="http://schemas.microsoft.com/office/word/2010/wordprocessingDrawing" xmlns:wp="http://schemas.openxmlformats.org/drawingml/2006/wordprocessingDrawing" xmlns:wpc="http://schemas.microsoft.com/office/word/2010/wordprocessingCanvas" xmlns:wpg="http://schemas.microsoft.com/office/word/2010/wordprocessingGroup" xmlns:wpi="http://schemas.microsoft.com/office/word/2010/wordprocessingInk" xmlns:wps="http://schemas.microsoft.com/office/word/2010/wordprocessingShape" mc:Ignorable="w14 wp14">
-  <w:p>
-    <w:pPr>
-      <w:pStyle w:val="Footer"/>
-      <w:jc w:val="center"/>
-    </w:pPr>
-    <w:r>
-      <w:rPr>
-        <w:rFonts w:ascii="Arial" w:hAnsi="Arial"/>
-        <w:b w:val="0"/>
-        <w:color w:val="4C5853"/>
-        <w:sz w:val="16"/>
-      </w:rPr>
-      <w:t>Conold Thando Chisinahama | Software and Product Resume</w:t>
-    </w:r>
-  </w:p>
-</w:ftr>
 </file>
 
 <file path=word/numbering.xml><?xml version="1.0" encoding="utf-8"?>
@@ -538,7 +482,7 @@
     <w:lvl w:ilvl="0">
       <w:start w:val="1"/>
       <w:numFmt w:val="bullet"/>
-      <w:lvlText w:val=""/>
+      <w:lvlText w:val="•"/>
       <w:lvlJc w:val="left"/>
       <w:pPr>
         <w:tabs>
@@ -547,7 +491,7 @@
         <w:ind w:left="1440" w:hanging="360"/>
       </w:pPr>
       <w:rPr>
-        <w:rFonts w:ascii="Symbol" w:hAnsi="Symbol" w:hint="default"/>
+        <w:rFonts w:ascii="Arial" w:hAnsi="Arial" w:hint="default"/>
       </w:rPr>
     </w:lvl>
   </w:abstractNum>
@@ -559,7 +503,7 @@
       <w:start w:val="1"/>
       <w:numFmt w:val="bullet"/>
       <w:pStyle w:val="ListBullet3"/>
-      <w:lvlText w:val=""/>
+      <w:lvlText w:val="•"/>
       <w:lvlJc w:val="left"/>
       <w:pPr>
         <w:tabs>
@@ -568,7 +512,7 @@
         <w:ind w:left="1080" w:hanging="360"/>
       </w:pPr>
       <w:rPr>
-        <w:rFonts w:ascii="Symbol" w:hAnsi="Symbol" w:hint="default"/>
+        <w:rFonts w:ascii="Arial" w:hAnsi="Arial" w:hint="default"/>
       </w:rPr>
     </w:lvl>
   </w:abstractNum>
@@ -580,7 +524,7 @@
       <w:start w:val="1"/>
       <w:numFmt w:val="bullet"/>
       <w:pStyle w:val="ListBullet2"/>
-      <w:lvlText w:val=""/>
+      <w:lvlText w:val="•"/>
       <w:lvlJc w:val="left"/>
       <w:pPr>
         <w:tabs>
@@ -589,7 +533,7 @@
         <w:ind w:left="720" w:hanging="360"/>
       </w:pPr>
       <w:rPr>
-        <w:rFonts w:ascii="Symbol" w:hAnsi="Symbol" w:hint="default"/>
+        <w:rFonts w:ascii="Arial" w:hAnsi="Arial" w:hint="default"/>
       </w:rPr>
     </w:lvl>
   </w:abstractNum>
@@ -619,7 +563,7 @@
       <w:start w:val="1"/>
       <w:numFmt w:val="bullet"/>
       <w:pStyle w:val="ListBullet"/>
-      <w:lvlText w:val=""/>
+      <w:lvlText w:val="•"/>
       <w:lvlJc w:val="left"/>
       <w:pPr>
         <w:tabs>
@@ -628,7 +572,7 @@
         <w:ind w:left="360" w:hanging="360"/>
       </w:pPr>
       <w:rPr>
-        <w:rFonts w:ascii="Symbol" w:hAnsi="Symbol" w:hint="default"/>
+        <w:rFonts w:ascii="Arial" w:hAnsi="Arial" w:hint="default"/>
       </w:rPr>
     </w:lvl>
   </w:abstractNum>
@@ -827,8 +771,8 @@
     </w:pPr>
     <w:rPr>
       <w:rFonts w:ascii="Arial" w:hAnsi="Arial"/>
-      <w:color w:val="17201D"/>
-      <w:sz w:val="19"/>
+      <w:color w:val="000000"/>
+      <w:sz w:val="20"/>
     </w:rPr>
   </w:style>
   <w:style w:type="paragraph" w:styleId="Header">
@@ -12522,7 +12466,7 @@
     </w:pPr>
     <w:rPr>
       <w:rFonts w:ascii="Arial" w:hAnsi="Arial"/>
-      <w:color w:val="4C5853"/>
+      <w:color w:val="2D2D2D"/>
       <w:sz w:val="18"/>
     </w:rPr>
   </w:style>

</xml_diff>

<commit_message>
docs: sharpen engineering resumes and refresh downloads (#3)
</commit_message>
<xml_diff>
--- a/public/documents/conold-chisinahama-resume-concise.docx
+++ b/public/documents/conold-chisinahama-resume-concise.docx
@@ -18,7 +18,7 @@
         <w:rPr>
           <w:rFonts w:ascii="Arial" w:hAnsi="Arial"/>
           <w:b/>
-          <w:color w:val="1D6665"/>
+          <w:color w:val="000000"/>
           <w:sz w:val="22"/>
         </w:rPr>
         <w:t>Full-Stack Software Developer | Customer Success Lead</w:t>
@@ -29,8 +29,34 @@
         <w:pStyle w:val="ResumeMeta"/>
       </w:pPr>
       <w:r>
-        <w:t>Johannesburg, South Africa | +27 82 886 8556 | cthandoc@gmail.com | linkedin.com/in/conold | github.com/thvndx</w:t>
+        <w:t>Johannesburg, South Africa | +27 82 886 8556 | cthandoc@gmail.com</w:t>
       </w:r>
+    </w:p>
+    <w:p>
+      <w:pPr>
+        <w:pStyle w:val="ResumeMeta"/>
+      </w:pPr>
+      <w:hyperlink r:id="rId9">
+        <w:r>
+          <w:t>conold-portfolio.vercel.app</w:t>
+        </w:r>
+      </w:hyperlink>
+      <w:r>
+        <w:t xml:space="preserve"> | </w:t>
+      </w:r>
+      <w:hyperlink r:id="rId10">
+        <w:r>
+          <w:t>linkedin.com/in/conold</w:t>
+        </w:r>
+      </w:hyperlink>
+      <w:r>
+        <w:t xml:space="preserve"> | </w:t>
+      </w:r>
+      <w:hyperlink r:id="rId11">
+        <w:r>
+          <w:t>github.com/thvndx</w:t>
+        </w:r>
+      </w:hyperlink>
     </w:p>
     <w:p>
       <w:pPr>
@@ -47,10 +73,10 @@
       <w:r>
         <w:rPr>
           <w:rFonts w:ascii="Arial" w:hAnsi="Arial"/>
-          <w:color w:val="17201D"/>
-          <w:sz w:val="18"/>
+          <w:color w:val="000000"/>
+          <w:sz w:val="20"/>
         </w:rPr>
-        <w:t>Full-stack software developer with a customer-success foundation, building secure operational products from problem definition through deployment. Leads a four-person support operation, with two direct reports, while delivering internal AI, analytics and workflow tools adopted across the team and adjacent departments.</w:t>
+        <w:t>Full-stack software developer building TypeScript applications, API integrations and analytics tools used by a four-person support operation and adjacent departments. Owns product definition, implementation, testing and deployment, drawing on customer-success leadership to solve operational problems.</w:t>
       </w:r>
     </w:p>
     <w:p>
@@ -69,19 +95,19 @@
         <w:rPr>
           <w:rFonts w:ascii="Arial" w:hAnsi="Arial"/>
           <w:b/>
-          <w:color w:val="17201D"/>
-          <w:sz w:val="18"/>
+          <w:color w:val="000000"/>
+          <w:sz w:val="20"/>
         </w:rPr>
-        <w:t xml:space="preserve">Engineering: </w:t>
+        <w:t xml:space="preserve">Development: </w:t>
       </w:r>
       <w:r>
         <w:rPr>
           <w:rFonts w:ascii="Arial" w:hAnsi="Arial"/>
           <w:b w:val="0"/>
-          <w:color w:val="4C5853"/>
-          <w:sz w:val="18"/>
+          <w:color w:val="2D2D2D"/>
+          <w:sz w:val="20"/>
         </w:rPr>
-        <w:t>TypeScript, React, Next.js, Node.js, Python, PostgreSQL, Supabase</w:t>
+        <w:t>TypeScript, JavaScript, React, Next.js, Node.js, Python, PostgreSQL</w:t>
       </w:r>
     </w:p>
     <w:p>
@@ -92,8 +118,8 @@
         <w:rPr>
           <w:rFonts w:ascii="Arial" w:hAnsi="Arial"/>
           <w:b/>
-          <w:color w:val="17201D"/>
-          <w:sz w:val="18"/>
+          <w:color w:val="000000"/>
+          <w:sz w:val="20"/>
         </w:rPr>
         <w:t xml:space="preserve">Delivery: </w:t>
       </w:r>
@@ -101,33 +127,10 @@
         <w:rPr>
           <w:rFonts w:ascii="Arial" w:hAnsi="Arial"/>
           <w:b w:val="0"/>
-          <w:color w:val="4C5853"/>
-          <w:sz w:val="18"/>
+          <w:color w:val="2D2D2D"/>
+          <w:sz w:val="20"/>
         </w:rPr>
-        <w:t>API integrations, data modeling, automation, testing, GitHub Actions, Railway, Vercel</w:t>
-      </w:r>
-    </w:p>
-    <w:p>
-      <w:pPr>
-        <w:spacing w:after="20"/>
-      </w:pPr>
-      <w:r>
-        <w:rPr>
-          <w:rFonts w:ascii="Arial" w:hAnsi="Arial"/>
-          <w:b/>
-          <w:color w:val="17201D"/>
-          <w:sz w:val="18"/>
-        </w:rPr>
-        <w:t xml:space="preserve">Product: </w:t>
-      </w:r>
-      <w:r>
-        <w:rPr>
-          <w:rFonts w:ascii="Arial" w:hAnsi="Arial"/>
-          <w:b w:val="0"/>
-          <w:color w:val="4C5853"/>
-          <w:sz w:val="18"/>
-        </w:rPr>
-        <w:t>Product discovery, operational analytics, customer-success systems, AI-assisted development</w:t>
+        <w:t>REST APIs, Supabase, Vitest, Playwright, GitHub Actions, Railway, Vercel</w:t>
       </w:r>
     </w:p>
     <w:p>
@@ -147,7 +150,7 @@
         <w:rPr>
           <w:rFonts w:ascii="Arial" w:hAnsi="Arial"/>
           <w:b/>
-          <w:color w:val="17201D"/>
+          <w:color w:val="000000"/>
           <w:sz w:val="21"/>
         </w:rPr>
         <w:t>Customer Success Lead</w:t>
@@ -156,7 +159,7 @@
         <w:rPr>
           <w:rFonts w:ascii="Arial" w:hAnsi="Arial"/>
           <w:b/>
-          <w:color w:val="4C5853"/>
+          <w:color w:val="2D2D2D"/>
           <w:sz w:val="21"/>
         </w:rPr>
         <w:t xml:space="preserve"> | Connectivity and e-commerce business</w:t>
@@ -179,10 +182,10 @@
       <w:r>
         <w:rPr>
           <w:rFonts w:ascii="Arial" w:hAnsi="Arial"/>
-          <w:color w:val="17201D"/>
-          <w:sz w:val="18"/>
+          <w:color w:val="000000"/>
+          <w:sz w:val="20"/>
         </w:rPr>
-        <w:t>Lead two direct reports within a four-person support operation spanning customer communication, technical escalation, call queues and shared inboxes.</w:t>
+        <w:t>Built and deployed full-stack tools for customer context, quality review and performance reporting, adopted across the full support team and adjacent departments.</w:t>
       </w:r>
     </w:p>
     <w:p>
@@ -194,10 +197,10 @@
       <w:r>
         <w:rPr>
           <w:rFonts w:ascii="Arial" w:hAnsi="Arial"/>
-          <w:color w:val="17201D"/>
-          <w:sz w:val="18"/>
+          <w:color w:val="000000"/>
+          <w:sz w:val="20"/>
         </w:rPr>
-        <w:t>Maintain measured email response and callback times below two hours, with CSAT above 80%.</w:t>
+        <w:t>Integrated support, call and commerce data into a customer workspace, reducing context gathering from approximately 20 minutes to 30 seconds per interaction.</w:t>
       </w:r>
     </w:p>
     <w:p>
@@ -209,10 +212,10 @@
       <w:r>
         <w:rPr>
           <w:rFonts w:ascii="Arial" w:hAnsi="Arial"/>
-          <w:color w:val="17201D"/>
-          <w:sz w:val="18"/>
+          <w:color w:val="000000"/>
+          <w:sz w:val="20"/>
         </w:rPr>
-        <w:t>Define, build, test and deploy internal full-stack products for customer context, quality assurance, experience analysis and performance reporting.</w:t>
+        <w:t>Automated KPI report generation and QA selection/compilation, reducing each workflow from approximately two hours to about one minute while retaining human review.</w:t>
       </w:r>
     </w:p>
     <w:p>
@@ -224,10 +227,10 @@
       <w:r>
         <w:rPr>
           <w:rFonts w:ascii="Arial" w:hAnsi="Arial"/>
-          <w:color w:val="17201D"/>
-          <w:sz w:val="18"/>
+          <w:color w:val="000000"/>
+          <w:sz w:val="20"/>
         </w:rPr>
-        <w:t>Reduced customer-context gathering from approximately 20 minutes to 30 seconds per interaction by consolidating fragmented provider data.</w:t>
+        <w:t>Implemented explicit identity review, independent access controls and data-freshness states to prevent ambiguous or incomplete data from driving unsafe decisions.</w:t>
       </w:r>
     </w:p>
     <w:p>
@@ -239,25 +242,10 @@
       <w:r>
         <w:rPr>
           <w:rFonts w:ascii="Arial" w:hAnsi="Arial"/>
-          <w:color w:val="17201D"/>
-          <w:sz w:val="18"/>
+          <w:color w:val="000000"/>
+          <w:sz w:val="20"/>
         </w:rPr>
-        <w:t>Reduced KPI report generation and QA selection/compilation from approximately two hours to about one minute while retaining human review.</w:t>
-      </w:r>
-    </w:p>
-    <w:p>
-      <w:pPr>
-        <w:pStyle w:val="ListBullet"/>
-        <w:spacing w:after="28" w:line="240" w:lineRule="auto"/>
-        <w:ind w:left="259" w:hanging="202"/>
-      </w:pPr>
-      <w:r>
-        <w:rPr>
-          <w:rFonts w:ascii="Arial" w:hAnsi="Arial"/>
-          <w:color w:val="17201D"/>
-          <w:sz w:val="18"/>
-        </w:rPr>
-        <w:t>Drove adoption across all four support agents and adjacent departments; reduced recurring software costs through vendor negotiation and provider changes.</w:t>
+        <w:t>Lead two direct reports within a four-person operation; maintain measured email response and callback times below two hours and customer satisfaction above 80%.</w:t>
       </w:r>
     </w:p>
     <w:p>
@@ -276,8 +264,8 @@
         <w:rPr>
           <w:rFonts w:ascii="Arial" w:hAnsi="Arial"/>
           <w:b/>
-          <w:color w:val="17201D"/>
-          <w:sz w:val="18"/>
+          <w:color w:val="000000"/>
+          <w:sz w:val="20"/>
         </w:rPr>
         <w:t xml:space="preserve">Support Quality Platform: </w:t>
       </w:r>
@@ -285,10 +273,10 @@
         <w:rPr>
           <w:rFonts w:ascii="Arial" w:hAnsi="Arial"/>
           <w:b w:val="0"/>
-          <w:color w:val="4C5853"/>
-          <w:sz w:val="18"/>
+          <w:color w:val="2D2D2D"/>
+          <w:sz w:val="20"/>
         </w:rPr>
-        <w:t>AI-assisted, evidence-backed conversation QA with explicit manual, automation and reporting controls.</w:t>
+        <w:t>TypeScript, React, Node.js, PostgreSQL, OpenAI. Built evidence-backed conversation scoring, sampling and manager reporting with separate manual and automated permissions.</w:t>
       </w:r>
     </w:p>
     <w:p>
@@ -299,8 +287,8 @@
         <w:rPr>
           <w:rFonts w:ascii="Arial" w:hAnsi="Arial"/>
           <w:b/>
-          <w:color w:val="17201D"/>
-          <w:sz w:val="18"/>
+          <w:color w:val="000000"/>
+          <w:sz w:val="20"/>
         </w:rPr>
         <w:t xml:space="preserve">Customer Operations Workbench: </w:t>
       </w:r>
@@ -308,10 +296,10 @@
         <w:rPr>
           <w:rFonts w:ascii="Arial" w:hAnsi="Arial"/>
           <w:b w:val="0"/>
-          <w:color w:val="4C5853"/>
-          <w:sz w:val="18"/>
+          <w:color w:val="2D2D2D"/>
+          <w:sz w:val="20"/>
         </w:rPr>
-        <w:t>Unified customer context across support, call and commerce systems with fail-closed identity review.</w:t>
+        <w:t>TypeScript, React, Node.js, PostgreSQL, Redis. Integrated Front, Shopify and Aircall with bounded caching and explicit review of conflicting customer matches.</w:t>
       </w:r>
     </w:p>
     <w:p>
@@ -322,8 +310,8 @@
         <w:rPr>
           <w:rFonts w:ascii="Arial" w:hAnsi="Arial"/>
           <w:b/>
-          <w:color w:val="17201D"/>
-          <w:sz w:val="18"/>
+          <w:color w:val="000000"/>
+          <w:sz w:val="20"/>
         </w:rPr>
         <w:t xml:space="preserve">Operations Performance Hub: </w:t>
       </w:r>
@@ -331,10 +319,10 @@
         <w:rPr>
           <w:rFonts w:ascii="Arial" w:hAnsi="Arial"/>
           <w:b w:val="0"/>
-          <w:color w:val="4C5853"/>
-          <w:sz w:val="18"/>
+          <w:color w:val="2D2D2D"/>
+          <w:sz w:val="20"/>
         </w:rPr>
-        <w:t>Provider-backed KPI reporting with explicit data freshness, eligibility and request-budget controls.</w:t>
+        <w:t>TypeScript, React, PostgreSQL. Separated raw activity from KPI eligibility and added persisted, budget-aware provider synchronization.</w:t>
       </w:r>
     </w:p>
     <w:p>
@@ -345,31 +333,8 @@
         <w:rPr>
           <w:rFonts w:ascii="Arial" w:hAnsi="Arial"/>
           <w:b/>
-          <w:color w:val="17201D"/>
-          <w:sz w:val="18"/>
-        </w:rPr>
-        <w:t xml:space="preserve">PromoStudio: </w:t>
-      </w:r>
-      <w:r>
-        <w:rPr>
-          <w:rFonts w:ascii="Arial" w:hAnsi="Arial"/>
-          <w:b w:val="0"/>
-          <w:color w:val="4C5853"/>
-          <w:sz w:val="18"/>
-        </w:rPr>
-        <w:t>Approval-first AI campaign generation, scheduling and social-provider integration.</w:t>
-      </w:r>
-    </w:p>
-    <w:p>
-      <w:pPr>
-        <w:spacing w:after="30"/>
-      </w:pPr>
-      <w:r>
-        <w:rPr>
-          <w:rFonts w:ascii="Arial" w:hAnsi="Arial"/>
-          <w:b/>
-          <w:color w:val="17201D"/>
-          <w:sz w:val="18"/>
+          <w:color w:val="000000"/>
+          <w:sz w:val="20"/>
         </w:rPr>
         <w:t xml:space="preserve">Recalibrate: </w:t>
       </w:r>
@@ -377,10 +342,10 @@
         <w:rPr>
           <w:rFonts w:ascii="Arial" w:hAnsi="Arial"/>
           <w:b w:val="0"/>
-          <w:color w:val="4C5853"/>
-          <w:sz w:val="18"/>
+          <w:color w:val="2D2D2D"/>
+          <w:sz w:val="20"/>
         </w:rPr>
-        <w:t>Local-first mobile planning built around adaptive scheduling and supervised guidance.</w:t>
+        <w:t>React Native, Expo. Built a local-first planning MVP with adaptive scheduling and supervised guidance.</w:t>
       </w:r>
     </w:p>
     <w:p>
@@ -398,8 +363,8 @@
       <w:r>
         <w:rPr>
           <w:rFonts w:ascii="Arial" w:hAnsi="Arial"/>
-          <w:color w:val="17201D"/>
-          <w:sz w:val="18"/>
+          <w:color w:val="000000"/>
+          <w:sz w:val="19"/>
         </w:rPr>
         <w:t>Technical Sales and Support, 2020-2023 | Technician, 2019 | Technical Sales Consultant, 2015-2017</w:t>
       </w:r>
@@ -412,8 +377,8 @@
         <w:rPr>
           <w:rFonts w:ascii="Arial" w:hAnsi="Arial"/>
           <w:b/>
-          <w:color w:val="17201D"/>
-          <w:sz w:val="18"/>
+          <w:color w:val="000000"/>
+          <w:sz w:val="19"/>
         </w:rPr>
         <w:t>National Diploma in Business Information Technology, University of Johannesburg, 2014-2018</w:t>
       </w:r>
@@ -422,14 +387,13 @@
       <w:r>
         <w:rPr>
           <w:rFonts w:ascii="Arial" w:hAnsi="Arial"/>
-          <w:color w:val="17201D"/>
-          <w:sz w:val="18"/>
+          <w:color w:val="000000"/>
+          <w:sz w:val="19"/>
         </w:rPr>
         <w:t>Peplink Certified Engineer, awarded November 2025, valid through November 2027</w:t>
       </w:r>
     </w:p>
     <w:sectPr>
-      <w:footerReference w:type="default" r:id="rId9"/>
       <w:pgSz w:w="12240" w:h="15840"/>
       <w:pgMar w:top="835" w:right="1037" w:bottom="835" w:left="1037" w:header="720" w:footer="720" w:gutter="0"/>
       <w:cols w:space="720"/>
@@ -437,26 +401,6 @@
     </w:sectPr>
   </w:body>
 </w:document>
-</file>
-
-<file path=word/footer1.xml><?xml version="1.0" encoding="utf-8"?>
-<w:ftr xmlns:m="http://schemas.openxmlformats.org/officeDocument/2006/math" xmlns:mc="http://schemas.openxmlformats.org/markup-compatibility/2006" xmlns:mo="http://schemas.microsoft.com/office/mac/office/2008/main" xmlns:mv="urn:schemas-microsoft-com:mac:vml" xmlns:o="urn:schemas-microsoft-com:office:office" xmlns:r="http://schemas.openxmlformats.org/officeDocument/2006/relationships" xmlns:v="urn:schemas-microsoft-com:vml" xmlns:w10="urn:schemas-microsoft-com:office:word" xmlns:w14="http://schemas.microsoft.com/office/word/2010/wordml" xmlns:w="http://schemas.openxmlformats.org/wordprocessingml/2006/main" xmlns:wne="http://schemas.microsoft.com/office/word/2006/wordml" xmlns:wp14="http://schemas.microsoft.com/office/word/2010/wordprocessingDrawing" xmlns:wp="http://schemas.openxmlformats.org/drawingml/2006/wordprocessingDrawing" xmlns:wpc="http://schemas.microsoft.com/office/word/2010/wordprocessingCanvas" xmlns:wpg="http://schemas.microsoft.com/office/word/2010/wordprocessingGroup" xmlns:wpi="http://schemas.microsoft.com/office/word/2010/wordprocessingInk" xmlns:wps="http://schemas.microsoft.com/office/word/2010/wordprocessingShape" mc:Ignorable="w14 wp14">
-  <w:p>
-    <w:pPr>
-      <w:pStyle w:val="Footer"/>
-      <w:jc w:val="center"/>
-    </w:pPr>
-    <w:r>
-      <w:rPr>
-        <w:rFonts w:ascii="Arial" w:hAnsi="Arial"/>
-        <w:b w:val="0"/>
-        <w:color w:val="4C5853"/>
-        <w:sz w:val="16"/>
-      </w:rPr>
-      <w:t>Conold Thando Chisinahama | Software and Product Resume</w:t>
-    </w:r>
-  </w:p>
-</w:ftr>
 </file>
 
 <file path=word/numbering.xml><?xml version="1.0" encoding="utf-8"?>
@@ -538,7 +482,7 @@
     <w:lvl w:ilvl="0">
       <w:start w:val="1"/>
       <w:numFmt w:val="bullet"/>
-      <w:lvlText w:val=""/>
+      <w:lvlText w:val="•"/>
       <w:lvlJc w:val="left"/>
       <w:pPr>
         <w:tabs>
@@ -547,7 +491,7 @@
         <w:ind w:left="1440" w:hanging="360"/>
       </w:pPr>
       <w:rPr>
-        <w:rFonts w:ascii="Symbol" w:hAnsi="Symbol" w:hint="default"/>
+        <w:rFonts w:ascii="Arial" w:hAnsi="Arial" w:hint="default"/>
       </w:rPr>
     </w:lvl>
   </w:abstractNum>
@@ -559,7 +503,7 @@
       <w:start w:val="1"/>
       <w:numFmt w:val="bullet"/>
       <w:pStyle w:val="ListBullet3"/>
-      <w:lvlText w:val=""/>
+      <w:lvlText w:val="•"/>
       <w:lvlJc w:val="left"/>
       <w:pPr>
         <w:tabs>
@@ -568,7 +512,7 @@
         <w:ind w:left="1080" w:hanging="360"/>
       </w:pPr>
       <w:rPr>
-        <w:rFonts w:ascii="Symbol" w:hAnsi="Symbol" w:hint="default"/>
+        <w:rFonts w:ascii="Arial" w:hAnsi="Arial" w:hint="default"/>
       </w:rPr>
     </w:lvl>
   </w:abstractNum>
@@ -580,7 +524,7 @@
       <w:start w:val="1"/>
       <w:numFmt w:val="bullet"/>
       <w:pStyle w:val="ListBullet2"/>
-      <w:lvlText w:val=""/>
+      <w:lvlText w:val="•"/>
       <w:lvlJc w:val="left"/>
       <w:pPr>
         <w:tabs>
@@ -589,7 +533,7 @@
         <w:ind w:left="720" w:hanging="360"/>
       </w:pPr>
       <w:rPr>
-        <w:rFonts w:ascii="Symbol" w:hAnsi="Symbol" w:hint="default"/>
+        <w:rFonts w:ascii="Arial" w:hAnsi="Arial" w:hint="default"/>
       </w:rPr>
     </w:lvl>
   </w:abstractNum>
@@ -619,7 +563,7 @@
       <w:start w:val="1"/>
       <w:numFmt w:val="bullet"/>
       <w:pStyle w:val="ListBullet"/>
-      <w:lvlText w:val=""/>
+      <w:lvlText w:val="•"/>
       <w:lvlJc w:val="left"/>
       <w:pPr>
         <w:tabs>
@@ -628,7 +572,7 @@
         <w:ind w:left="360" w:hanging="360"/>
       </w:pPr>
       <w:rPr>
-        <w:rFonts w:ascii="Symbol" w:hAnsi="Symbol" w:hint="default"/>
+        <w:rFonts w:ascii="Arial" w:hAnsi="Arial" w:hint="default"/>
       </w:rPr>
     </w:lvl>
   </w:abstractNum>
@@ -827,8 +771,8 @@
     </w:pPr>
     <w:rPr>
       <w:rFonts w:ascii="Arial" w:hAnsi="Arial"/>
-      <w:color w:val="17201D"/>
-      <w:sz w:val="19"/>
+      <w:color w:val="000000"/>
+      <w:sz w:val="20"/>
     </w:rPr>
   </w:style>
   <w:style w:type="paragraph" w:styleId="Header">
@@ -12522,7 +12466,7 @@
     </w:pPr>
     <w:rPr>
       <w:rFonts w:ascii="Arial" w:hAnsi="Arial"/>
-      <w:color w:val="4C5853"/>
+      <w:color w:val="2D2D2D"/>
       <w:sz w:val="18"/>
     </w:rPr>
   </w:style>

</xml_diff>

<commit_message>
docs: unify software and customer-success resume positioning
</commit_message>
<xml_diff>
--- a/public/documents/conold-chisinahama-resume-concise.docx
+++ b/public/documents/conold-chisinahama-resume-concise.docx
@@ -21,7 +21,7 @@
           <w:color w:val="000000"/>
           <w:sz w:val="22"/>
         </w:rPr>
-        <w:t>Full-Stack Software Developer | Customer Success Lead</w:t>
+        <w:t>Full-Stack Software Developer</w:t>
       </w:r>
     </w:p>
     <w:p>
@@ -76,7 +76,7 @@
           <w:color w:val="000000"/>
           <w:sz w:val="20"/>
         </w:rPr>
-        <w:t>Full-stack software developer building TypeScript applications, API integrations and analytics tools used by a four-person support operation and adjacent departments. Owns product definition, implementation, testing and deployment, drawing on customer-success leadership to solve operational problems.</w:t>
+        <w:t>Full-stack software developer with a customer-success background, turning customer and operational needs into deployed applications. Builds TypeScript products, API integrations and analytics tools used across a four-person support operation and adjacent departments. Owns delivery from problem definition through testing, deployment and release verification.</w:t>
       </w:r>
     </w:p>
     <w:p>
@@ -171,6 +171,14 @@
       </w:pPr>
       <w:r>
         <w:t>January 2023 - Present | Remote / Johannesburg</w:t>
+      </w:r>
+    </w:p>
+    <w:p>
+      <w:pPr>
+        <w:pStyle w:val="ResumeMeta"/>
+      </w:pPr>
+      <w:r>
+        <w:t>Role combines customer-success leadership with hands-on development of internal software.</w:t>
       </w:r>
     </w:p>
     <w:p>

</xml_diff>

<commit_message>
docs: unify software and customer-success resume positioning (#4)
</commit_message>
<xml_diff>
--- a/public/documents/conold-chisinahama-resume-concise.docx
+++ b/public/documents/conold-chisinahama-resume-concise.docx
@@ -21,7 +21,7 @@
           <w:color w:val="000000"/>
           <w:sz w:val="22"/>
         </w:rPr>
-        <w:t>Full-Stack Software Developer | Customer Success Lead</w:t>
+        <w:t>Full-Stack Software Developer</w:t>
       </w:r>
     </w:p>
     <w:p>
@@ -76,7 +76,7 @@
           <w:color w:val="000000"/>
           <w:sz w:val="20"/>
         </w:rPr>
-        <w:t>Full-stack software developer building TypeScript applications, API integrations and analytics tools used by a four-person support operation and adjacent departments. Owns product definition, implementation, testing and deployment, drawing on customer-success leadership to solve operational problems.</w:t>
+        <w:t>Full-stack software developer with a customer-success background, turning customer and operational needs into deployed applications. Builds TypeScript products, API integrations and analytics tools used across a four-person support operation and adjacent departments. Owns delivery from problem definition through testing, deployment and release verification.</w:t>
       </w:r>
     </w:p>
     <w:p>
@@ -171,6 +171,14 @@
       </w:pPr>
       <w:r>
         <w:t>January 2023 - Present | Remote / Johannesburg</w:t>
+      </w:r>
+    </w:p>
+    <w:p>
+      <w:pPr>
+        <w:pStyle w:val="ResumeMeta"/>
+      </w:pPr>
+      <w:r>
+        <w:t>Role combines customer-success leadership with hands-on development of internal software.</w:t>
       </w:r>
     </w:p>
     <w:p>

</xml_diff>